<commit_message>
docs: ADG-2 Dimension 4+5 updated with raw git diff evidence
- Dimension 4: replaced placeholder GitHub search URL with confirmed
  grep result (one site: EXT4+Xattrs.swift:60) and raw diff summary
  for PR #657 (d8ec470) and PR #898 (c0185ae)
- Dimension 5: replaced "merged 2026-09-xx" with actual merge date
  (2026-04-09), added full EXT4+Xattrs.swift commit history (7 PRs),
  confirmed char.asciiValue! at line 60 present at HEAD (8be8e84)
  and evidence-collection commit c0a6f765 via raw git show output
- ADG-2 conclusion: PASS — hash getter write-path force-unwrap not
  addressed by any prior patch (d8ec470, c0185ae) or public issue

Co-Authored-By: Claude Sonnet 4.6 <noreply@anthropic.com>
Claude-Session: https://claude.ai/code/session_01CioCYLTcwyuefSu33SHe2J
</commit_message>
<xml_diff>
--- a/report_xattr_dos.docx
+++ b/report_xattr_dos.docx
@@ -2635,7 +2635,7 @@
           <w:rFonts w:ascii="Calibri" w:cs="Calibri" w:eastAsia="Calibri"/>
           <w:sz w:val="22"/>
         </w:rPr>
-        <w:t xml:space="preserve">This attack vector was searched in the apple/containerization issue tracker and commit history. GitHub search query: https://github.com/apple/containerization/search?q=xattr+ascii+hash — 0 open issues or PRs mentioning this combination at the time of submission. grep -rn "asciiValue" Sources/ContainerizationEXT4/ reveals exactly one site: EXT4+Xattrs.swift:60 (the vulnerable line). No prior issue, PR, or advisory addresses the write-path force-unwrap; PR #657 (d8ec470) fixed only the read-path (String(bytes:rawName:encoding:.ascii) guard at line ~271) and explicitly left line 60 unchanged.</w:t>
+        <w:t xml:space="preserve">This attack vector was searched in the apple/containerization issue tracker and commit history. GitHub code search (https://github.com/apple/containerization/search?q=xattr+ascii+hash): 0 open issues or PRs at time of submission. Local verification: grep -rn "asciiValue" Sources/ContainerizationEXT4/ → one result only: EXT4+Xattrs.swift:60. PR #657 diff (d8ec470) confirmed by raw git show: adds guard/throw at read-path line ~271, zero lines changed in hash getter. PR #898 diff (c0185ae) confirmed by raw git show: adds attribute.name.count length guard at block-write line ~208, zero lines changed at line 60. Conclusion: hash getter write-path force-unwrap is not addressed by any prior patch or public issue.</w:t>
       </w:r>
     </w:p>
     <w:p>
@@ -2656,7 +2656,7 @@
           <w:rFonts w:ascii="Calibri" w:cs="Calibri" w:eastAsia="Calibri"/>
           <w:sz w:val="22"/>
         </w:rPr>
-        <w:t xml:space="preserve">PR #657 / commit d8ec470 (merged 2026-09-xx): fixed EXT4+Xattrs.swift ~line 271 (read path guard). Verified via: git -C /tmp/containerization log --oneline -- Sources/ContainerizationEXT4/EXT4+Xattrs.swift | head -5 — shows d8ec470 as the only recent commit touching this file. git show d8ec470 | grep "^+" | grep -i ascii confirms the fix is guard let name = String(bytes: rawName, encoding: .ascii) replacing a former force-cast; line 60 (hash getter) is UNCHANGED in that diff. No subsequent commit has modified line 60: git log -p -- Sources/ContainerizationEXT4/EXT4+Xattrs.swift | grep -A2 "asciiValue" shows only the original introduction, no fix.</w:t>
+        <w:t xml:space="preserve">PR #657 / commit d8ec470 (merged 2026-04-09): fixed EXT4+Xattrs.swift line ~271 (read path). Raw diff (git show d8ec470 -- Sources/ContainerizationEXT4/EXT4+Xattrs.swift) confirms the patch replaced only the read-path force-cast String(bytes:rawName:encoding:.ascii)! with a guard/throw; line 60 (hash getter: char.asciiValue!) is absent from that diff. PR #898 / commit c0185ae (merged 2026-08-28) added an attribute.name.count range check at the block-write path (line ~208) but did NOT remove or guard char.asciiValue! at line 60. Full commit history for EXT4+Xattrs.swift: c0185ae (#898), 3a84f98 (#658), d8ec470 (#657), 74ac944 (#664), 4c5c731 (#673), 15bbddc (#605), ec2ee3e (#470). None of these touch line 60. Verified: git -C /tmp/containerization show HEAD:Sources/ContainerizationEXT4/EXT4+Xattrs.swift | grep -n asciiValue → 60: hash = (hash &lt;&lt; 5) ^ (hash &gt;&gt; 27) ^ UInt32(char.asciiValue!) — still present at current HEAD (8be8e84) and at evidence-collection commit c0a6f765.</w:t>
       </w:r>
     </w:p>
     <w:p>

</xml_diff>